<commit_message>
fix(report): match template font sizes, leave certificate blank as-is, remove all ? encoding artifacts
</commit_message>
<xml_diff>
--- a/Municipal_Waste_Fleet_Tracking_Mini_Project_Report.docx
+++ b/Municipal_Waste_Fleet_Tracking_Mini_Project_Report.docx
@@ -12,7 +12,7 @@
           <w:rFonts w:ascii="Times New Roman" w:hAnsi="Times New Roman"/>
           <w:b/>
           <w:color w:val="0F172A"/>
-          <w:sz w:val="32"/>
+          <w:sz w:val="28"/>
         </w:rPr>
         <w:t>GPS-BASED FLEET TRACKING AND ROUTE VERIFICATION SYSTEM FOR MUNICIPAL SOLID WASTE MANAGEMENT</w:t>
       </w:r>
@@ -30,7 +30,7 @@
         </w:rPr>
         <w:t>A Mini Project Report submitted as part of the academic requirements for the</w:t>
         <w:br/>
-        <w:t>23CS4219 - Software Engineering Laboratory</w:t>
+        <w:t>23CS4219- Software Engineering Laboratory</w:t>
         <w:br/>
         <w:br/>
         <w:t>BACHELOR OF TECHNOLOGY</w:t>
@@ -48,7 +48,7 @@
       <w:r>
         <w:drawing>
           <wp:inline xmlns:a="http://schemas.openxmlformats.org/drawingml/2006/main" xmlns:pic="http://schemas.openxmlformats.org/drawingml/2006/picture">
-            <wp:extent cx="1645920" cy="1686897"/>
+            <wp:extent cx="1371600" cy="1405748"/>
             <wp:docPr id="1" name="Picture 1"/>
             <wp:cNvGraphicFramePr>
               <a:graphicFrameLocks noChangeAspect="1"/>
@@ -69,7 +69,7 @@
                   <pic:spPr>
                     <a:xfrm>
                       <a:off x="0" y="0"/>
-                      <a:ext cx="1645920" cy="1686897"/>
+                      <a:ext cx="1371600" cy="1405748"/>
                     </a:xfrm>
                     <a:prstGeom prst="rect"/>
                   </pic:spPr>
@@ -98,11 +98,9 @@
         <w:rPr>
           <w:rFonts w:ascii="Times New Roman" w:hAnsi="Times New Roman"/>
           <w:b/>
-          <w:sz w:val="26"/>
+          <w:sz w:val="24"/>
         </w:rPr>
         <w:t>SAIKIRAN BORA (A24126510006)</w:t>
-        <w:br/>
-        <w:t>Section ? A, III Year B.Tech. CSE</w:t>
         <w:br/>
         <w:br/>
       </w:r>
@@ -121,7 +119,7 @@
           <w:b/>
           <w:sz w:val="24"/>
         </w:rPr>
-        <w:t>Prof. A. Rohini</w:t>
+        <w:t>Prof. A. Rohini,</w:t>
         <w:br/>
         <w:t>Department of Computer Science and Engineering</w:t>
         <w:br/>
@@ -136,17 +134,15 @@
         <w:rPr>
           <w:rFonts w:ascii="Times New Roman" w:hAnsi="Times New Roman"/>
           <w:b/>
-          <w:sz w:val="20"/>
+          <w:sz w:val="24"/>
         </w:rPr>
         <w:t>DEPARTMENT OF COMPUTER SCIENCE AND ENGINEERING</w:t>
         <w:br/>
         <w:t>ANIL NEERUKONDA INSTITUTE OF TECHNOLOGY AND SCIENCES (UGC AUTONOMOUS)</w:t>
         <w:br/>
-        <w:t>(Permanently Affiliated to AU, Approved by AICTE and Accredited by NBA &amp; NAAC with ?A? Grade)</w:t>
+        <w:t>(Permanently Affiliated to AU, Approved by AICTE and Accredited by NBA &amp; NAAC with 'A' Grade)</w:t>
         <w:br/>
-        <w:t>Sangivalasa, Bheemili Mandal, Visakhapatnam Dist. (A.P) - 531162</w:t>
-        <w:br/>
-        <w:t>ACADEMIC YEAR 2026 ? 2027</w:t>
+        <w:t>Sangivalasa, bheemili mandal, visakhapatnam dist.(A.P) 2026 - 2027</w:t>
       </w:r>
     </w:p>
     <w:p>
@@ -163,7 +159,7 @@
         <w:rPr>
           <w:rFonts w:ascii="Times New Roman" w:hAnsi="Times New Roman"/>
           <w:b/>
-          <w:sz w:val="20"/>
+          <w:sz w:val="24"/>
         </w:rPr>
         <w:t>DEPARTMENT OF COMPUTER SCIENCE AND ENGINEERING</w:t>
         <w:br/>
@@ -171,9 +167,9 @@
         <w:br/>
         <w:t>(UGC AUTONOMOUS)</w:t>
         <w:br/>
-        <w:t>(Affiliated to AU, Approved by AICTE and Accredited by NBA &amp; NAAC with ?A? Grade)</w:t>
+        <w:t>(Affiliated to AU, Approved by AICTE and Accredited by NBA &amp; NAAC with 'A' Grade)</w:t>
         <w:br/>
-        <w:t>Sangivalasa, Bheemili Mandal, Visakhapatnam Dist. (A.P)</w:t>
+        <w:t>Sangivalasa, bheemili mandal, visakhapatnam dist.(A.P)</w:t>
         <w:br/>
       </w:r>
     </w:p>
@@ -226,14 +222,14 @@
         <w:rPr>
           <w:rFonts w:ascii="Times New Roman" w:hAnsi="Times New Roman"/>
           <w:b/>
-          <w:sz w:val="30"/>
+          <w:sz w:val="28"/>
         </w:rPr>
         <w:t>CERTIFICATE</w:t>
       </w:r>
     </w:p>
     <w:p>
       <w:pPr>
-        <w:spacing w:line="312" w:lineRule="auto" w:after="720"/>
+        <w:spacing w:line="312" w:lineRule="auto" w:after="600"/>
         <w:jc w:val="both"/>
       </w:pPr>
       <w:r>
@@ -241,7 +237,7 @@
           <w:rFonts w:ascii="Times New Roman" w:hAnsi="Times New Roman"/>
           <w:sz w:val="24"/>
         </w:rPr>
-        <w:t>This is to certify that the mini project report entitled "GPS-BASED FLEET TRACKING AND ROUTE VERIFICATION SYSTEM FOR MUNICIPAL SOLID WASTE MANAGEMENT" has been successfully completed by SAIKIRAN BORA (Roll No: A24126510006), student of III Year, I Semester B.Tech., Section ? A, in the Department of Computer Science and Engineering, Anil Neerukonda Institute of Technology and Sciences (Autonomous), Visakhapatnam, during the academic year 2026?2027 as part of the academic requirements for the 23CS4219 - Software Engineering Laboratory course.</w:t>
+        <w:t>This is to certify that the mini project entitled "________________________" has been successfully completed by the students of the Department of Computer Science and Engineering during the academic year 2026-2027 as part of the requirements for the 23CS4219-Software Engineering Laboratory.</w:t>
       </w:r>
     </w:p>
     <w:tbl>
@@ -261,19 +257,55 @@
           </w:tcPr>
           <w:p>
             <w:pPr>
+              <w:spacing w:after="720"/>
               <w:jc w:val="left"/>
             </w:pPr>
             <w:r>
               <w:rPr>
                 <w:rFonts w:ascii="Times New Roman" w:hAnsi="Times New Roman"/>
                 <w:b/>
-                <w:sz w:val="22"/>
+                <w:sz w:val="24"/>
+              </w:rPr>
+              <w:t>Faculty  Incharge</w:t>
+            </w:r>
+          </w:p>
+        </w:tc>
+        <w:tc>
+          <w:tcPr>
+            <w:tcW w:type="dxa" w:w="4608"/>
+          </w:tcPr>
+          <w:p>
+            <w:pPr>
+              <w:spacing w:after="720"/>
+              <w:jc w:val="right"/>
+            </w:pPr>
+            <w:r>
+              <w:rPr>
+                <w:rFonts w:ascii="Times New Roman" w:hAnsi="Times New Roman"/>
+                <w:b/>
+                <w:sz w:val="24"/>
+              </w:rPr>
+              <w:t>Head of the Department</w:t>
+            </w:r>
+          </w:p>
+        </w:tc>
+      </w:tr>
+      <w:tr>
+        <w:tc>
+          <w:tcPr>
+            <w:tcW w:type="dxa" w:w="4608"/>
+          </w:tcPr>
+          <w:p>
+            <w:pPr>
+              <w:jc w:val="left"/>
+            </w:pPr>
+            <w:r>
+              <w:rPr>
+                <w:rFonts w:ascii="Times New Roman" w:hAnsi="Times New Roman"/>
+                <w:b w:val="0"/>
+                <w:sz w:val="24"/>
               </w:rPr>
               <w:t>Prof. A. Rohini</w:t>
-              <w:br/>
-              <w:t>Faculty Incharge / Guide</w:t>
-              <w:br/>
-              <w:t>Dept. of CSE, ANITS</w:t>
             </w:r>
           </w:p>
         </w:tc>
@@ -288,14 +320,10 @@
             <w:r>
               <w:rPr>
                 <w:rFonts w:ascii="Times New Roman" w:hAnsi="Times New Roman"/>
-                <w:b/>
-                <w:sz w:val="22"/>
+                <w:b w:val="0"/>
+                <w:sz w:val="24"/>
               </w:rPr>
               <w:t>Prof. G. Srinivas</w:t>
-              <w:br/>
-              <w:t>Head of the Department</w:t>
-              <w:br/>
-              <w:t>Dept. of CSE, ANITS</w:t>
             </w:r>
           </w:p>
         </w:tc>
@@ -315,7 +343,7 @@
         <w:rPr>
           <w:rFonts w:ascii="Times New Roman" w:hAnsi="Times New Roman"/>
           <w:b/>
-          <w:sz w:val="20"/>
+          <w:sz w:val="24"/>
         </w:rPr>
         <w:t>DEPARTMENT OF COMPUTER SCIENCE AND ENGINEERING</w:t>
         <w:br/>
@@ -323,7 +351,9 @@
         <w:br/>
         <w:t>(UGC AUTONOMOUS)</w:t>
         <w:br/>
-        <w:t>Sangivalasa, Bheemili Mandal, Visakhapatnam Dist. (A.P)</w:t>
+        <w:t>(Affiliated to AU, Approved by AICTE and Accredited by NBA &amp; NAAC with 'A' Grade)</w:t>
+        <w:br/>
+        <w:t>Sangivalasa, bheemili mandal, visakhapatnam dist.(A.P)</w:t>
         <w:br/>
       </w:r>
     </w:p>
@@ -336,14 +366,14 @@
         <w:rPr>
           <w:rFonts w:ascii="Times New Roman" w:hAnsi="Times New Roman"/>
           <w:b/>
-          <w:sz w:val="30"/>
+          <w:sz w:val="28"/>
         </w:rPr>
         <w:t>DECLARATION</w:t>
       </w:r>
     </w:p>
     <w:p>
       <w:pPr>
-        <w:spacing w:line="312" w:lineRule="auto" w:after="800"/>
+        <w:spacing w:line="312" w:lineRule="auto" w:after="720"/>
         <w:jc w:val="both"/>
       </w:pPr>
       <w:r>
@@ -351,10 +381,10 @@
           <w:rFonts w:ascii="Times New Roman" w:hAnsi="Times New Roman"/>
           <w:sz w:val="24"/>
         </w:rPr>
-        <w:t>I, SAIKIRAN BORA (Roll No: A24126510006), student of III Year, I Semester B.Tech., Section ? A, in the Department of Computer Science and Engineering from Anil Neerukonda Institute of Technology and Sciences (Autonomous), Visakhapatnam, hereby declare that the mini project work entitled "GPS-BASED FLEET TRACKING AND ROUTE VERIFICATION SYSTEM FOR MUNICIPAL SOLID WASTE MANAGEMENT" is an authentic record of independent work carried out by me under the guidance of Prof. A. Rohini, Department of Computer Science and Engineering.</w:t>
+        <w:t>I, SAIKIRAN BORA (Roll No: A24126510006), student of III Year, I Semester B.Tech., Section - A, in the Department of Computer Science and Engineering from Anil Neerukonda Institute of Technology and Sciences (Autonomous), Visakhapatnam, hereby declare that the mini project work entitled "GPS-BASED FLEET TRACKING AND ROUTE VERIFICATION SYSTEM FOR MUNICIPAL SOLID WASTE MANAGEMENT" is an authentic record of independent work carried out by me under the guidance of Prof. A. Rohini, Department of Computer Science and Engineering.</w:t>
         <w:br/>
         <w:br/>
-        <w:t>I further declare that this mini project report is submitted as part of the academic requirements for the 23CS4219 - Software Engineering Laboratory during the academic year 2026?2027, and that the results embodied in this report have not been submitted to any other Institute or University for the award of any degree or diploma.</w:t>
+        <w:t>I further declare that this mini project report is submitted as part of the academic requirements for the 23CS4219 - Software Engineering Laboratory during the academic year 2026-2027, and that the results embodied in this report have not been submitted to any other Institute or University for the award of any degree or diploma.</w:t>
       </w:r>
     </w:p>
     <w:p>
@@ -365,13 +395,13 @@
         <w:rPr>
           <w:rFonts w:ascii="Times New Roman" w:hAnsi="Times New Roman"/>
           <w:b/>
-          <w:sz w:val="22"/>
+          <w:sz w:val="24"/>
         </w:rPr>
         <w:t>SAIKIRAN BORA</w:t>
         <w:br/>
         <w:t>Roll No: A24126510006</w:t>
         <w:br/>
-        <w:t>B.Tech. III Year, I Sem, Section ? A</w:t>
+        <w:t>B.Tech. III Year, I Sem, Section - A</w:t>
         <w:br/>
         <w:t>Dept. of CSE, ANITS</w:t>
       </w:r>
@@ -4344,7 +4374,7 @@
           <w:i w:val="0"/>
           <w:sz w:val="24"/>
         </w:rPr>
-        <w:t>Rapid urbanization, industrial expansion, and population growth across metropolitan and tier-2 Indian cities?such as Greater Visakhapatnam?have generated unprecedented quantities of municipal solid waste (MSW). Managing the daily collection, transportation, and safe disposal of solid waste represents one of the most resource-intensive and logistically challenging operations undertaken by municipal corporations. In a typical urban sector, hundreds of metric tons of domestic, commercial, and institutional waste must be cleared daily across dense residential wards, market yards, commercial districts, and peripheral coastal settlements. Efficient waste logistics directly determine civic public health, environmental hygiene, air and water quality, and resident satisfaction.</w:t>
+        <w:t>Rapid urbanization, industrial expansion, and population growth across metropolitan and tier-2 Indian cities - such as Greater Visakhapatnam - have generated unprecedented quantities of municipal solid waste (MSW). Managing the daily collection, transportation, and safe disposal of solid waste represents one of the most resource-intensive and logistically challenging operations undertaken by municipal corporations. In a typical urban sector, hundreds of metric tons of domestic, commercial, and institutional waste must be cleared daily across dense residential wards, market yards, commercial districts, and peripheral coastal settlements. Efficient waste logistics directly determine civic public health, environmental hygiene, air and water quality, and resident satisfaction.</w:t>
       </w:r>
     </w:p>
     <w:p>
@@ -4477,7 +4507,7 @@
           <w:rFonts w:ascii="Times New Roman" w:hAnsi="Times New Roman"/>
           <w:sz w:val="24"/>
         </w:rPr>
-        <w:t>When drivers encounter valid physical obstructions?such as road excavations, water-logging, or inaccessible narrow lanes?there is no mobile tool to record the justification, leaving supervisors unable to distinguish between genuine operational impediments and driver negligence.</w:t>
+        <w:t>When drivers encounter valid physical obstructions - such as road excavations, water-logging, or inaccessible narrow lanes - there is no mobile tool to record the justification, leaving supervisors unable to distinguish between genuine operational impediments and driver negligence.</w:t>
       </w:r>
     </w:p>
     <w:p>
@@ -4778,7 +4808,7 @@
           <w:i w:val="0"/>
           <w:sz w:val="24"/>
         </w:rPr>
-        <w:t>In the conventional municipal sanitation framework currently operational across most municipal wards, daily waste collection is managed through legacy manual methods. Every morning, drivers and ground sanitation crew assemble at the central zonal depot where supervisors verbally issue route instructions or hand over paper log sheets indicating the designated ward sector (e.g., Ward 1 Sangivalasa, Ward 2 Bheemili Coastal). The collection truck?typically a 2.5-ton tipper or 4-ton hydraulic compactor?departs the depot and follows historically established roadways.</w:t>
+        <w:t>In the conventional municipal sanitation framework currently operational across most municipal wards, daily waste collection is managed through legacy manual methods. Every morning, drivers and ground sanitation crew assemble at the central zonal depot where supervisors verbally issue route instructions or hand over paper log sheets indicating the designated ward sector (e.g., Ward 1 Sangivalasa, Ward 2 Bheemili Coastal). The collection truck - typically a 2.5-ton tipper or 4-ton hydraulic compactor - departs the depot and follows historically established roadways.</w:t>
       </w:r>
     </w:p>
     <w:p>
@@ -4911,7 +4941,7 @@
           <w:rFonts w:ascii="Times New Roman" w:hAnsi="Times New Roman"/>
           <w:sz w:val="24"/>
         </w:rPr>
-        <w:t>Because skipped stops are not digitally logged with categorized justifications, municipal engineers cannot identify recurring infrastructure issues?such as chronic illegal parking or prolonged pipeline trenching?that prevent waste clearance.</w:t>
+        <w:t>Because skipped stops are not digitally logged with categorized justifications, municipal engineers cannot identify recurring infrastructure issues - such as chronic illegal parking or prolonged pipeline trenching - that prevent waste clearance.</w:t>
       </w:r>
     </w:p>
     <w:p>
@@ -8818,7 +8848,7 @@
           <w:rFonts w:ascii="Times New Roman" w:hAnsi="Times New Roman"/>
           <w:sz w:val="24"/>
         </w:rPr>
-        <w:t>Monitors active collection vehicles, displaying live speed (km/h), fuel level, battery health, current assigned driver, and GPS lock precision (?4m).</w:t>
+        <w:t>Monitors active collection vehicles, displaying live speed (km/h), fuel level, battery health, current assigned driver, and GPS lock precision (+/- 4m).</w:t>
       </w:r>
     </w:p>
     <w:p>
@@ -11353,7 +11383,7 @@
           <w:rFonts w:ascii="Times New Roman" w:hAnsi="Times New Roman"/>
           <w:sz w:val="24"/>
         </w:rPr>
-        <w:t>Individual algorithmic modules?such as the Haversine spherical distance calculation function, ISO timestamp parser, and ticket ID generator?were tested in isolation with boundary value test fixtures.</w:t>
+        <w:t>Individual algorithmic modules - such as the Haversine spherical distance calculation function, ISO timestamp parser, and ticket ID generator - were tested in isolation with boundary value test fixtures.</w:t>
       </w:r>
     </w:p>
     <w:p>
@@ -13235,7 +13265,7 @@
           <w:i w:val="0"/>
           <w:sz w:val="22"/>
         </w:rPr>
-        <w:t>Short Explanation: Figure 12.4 displays the smartphone-optimized driver interface within a mobile frame. The view highlights the active driver profile (Ramesh Kumar), green GPS lock banner (?4m accuracy), route completion progress bar (33%), and interactive checkpoint cards featuring one-tap 'Mark Collected' and 'Skip' action buttons.</w:t>
+        <w:t>Short Explanation: Figure 12.4 displays the smartphone-optimized driver interface within a mobile frame. The view highlights the active driver profile (Ramesh Kumar), green GPS lock banner (+/- 4m accuracy), route completion progress bar (33%), and interactive checkpoint cards featuring one-tap 'Mark Collected' and 'Skip' action buttons.</w:t>
       </w:r>
     </w:p>
     <w:p>
@@ -13601,7 +13631,7 @@
           <w:i w:val="0"/>
           <w:sz w:val="24"/>
         </w:rPr>
-        <w:t>The development and deployment of the GPS-Based Fleet Tracking and Route Verification System (CivicClean GIS) successfully demonstrates the power of Software Engineering principles in resolving complex, real-world civic challenges. By selecting and implementing Solution 2?a pure software-only architecture?this project achieved complete operational transparency, route verifiability, and administrative accountability in municipal solid waste collection without incurring any capital expense for custom in-bin hardware sensors.</w:t>
+        <w:t>The development and deployment of the GPS-Based Fleet Tracking and Route Verification System (CivicClean GIS) successfully demonstrates the power of Software Engineering principles in resolving complex, real-world civic challenges. By selecting and implementing Solution 2 - a pure software-only architecture - this project achieved complete operational transparency, route verifiability, and administrative accountability in municipal solid waste collection without incurring any capital expense for custom in-bin hardware sensors.</w:t>
       </w:r>
     </w:p>
     <w:p>
@@ -13732,7 +13762,7 @@
           <w:rFonts w:ascii="Times New Roman" w:hAnsi="Times New Roman"/>
           <w:sz w:val="24"/>
         </w:rPr>
-        <w:t>M. A. Hannan, M. Arebey, R. A. Begum, and H. Basri, "An Automated Waste Collection System using RFID and GPS Technology", IEEE Transactions on Intelligent Transportation Systems, Vol. 13, No. 3, pp. 1329?1338, 2012.</w:t>
+        <w:t>M. A. Hannan, M. Arebey, R. A. Begum, and H. Basri, "An Automated Waste Collection System using RFID and GPS Technology", IEEE Transactions on Intelligent Transportation Systems, Vol. 13, No. 3, pp. 1329-1338, 2012.</w:t>
       </w:r>
     </w:p>
     <w:p>
@@ -13754,7 +13784,7 @@
           <w:rFonts w:ascii="Times New Roman" w:hAnsi="Times New Roman"/>
           <w:sz w:val="24"/>
         </w:rPr>
-        <w:t>A. Zanella, N. Bui, A. Castellani, L. Vangelista, and M. Zorzi, "Internet of Things for Smart Cities", IEEE Internet of Things Journal, Vol. 1, No. 1, pp. 22?32, 2014.</w:t>
+        <w:t>A. Zanella, N. Bui, A. Castellani, L. Vangelista, and M. Zorzi, "Internet of Things for Smart Cities", IEEE Internet of Things Journal, Vol. 1, No. 1, pp. 22-32, 2014.</w:t>
       </w:r>
     </w:p>
     <w:p>
@@ -13930,7 +13960,7 @@
         <w:br/>
         <w:t>2. Tap the 'Driver Field App' tab.</w:t>
         <w:br/>
-        <w:t>3. Verify the green banner shows 'GPS Active &amp; Geofencing Enabled (?4m Accuracy)'.</w:t>
+        <w:t>3. Verify the green banner shows 'GPS Active &amp; Geofencing Enabled (+/- 4m Accuracy)'.</w:t>
         <w:br/>
         <w:t>4. Review the chronological checklist of assigned checkpoints.</w:t>
         <w:br/>

</xml_diff>